<commit_message>
Further improvement, framelines in Excel tables can be surpressed.
</commit_message>
<xml_diff>
--- a/data/cv/Projektliste.docx
+++ b/data/cv/Projektliste.docx
@@ -330,6 +330,7 @@
           </mc:Fallback>
         </mc:AlternateContent>
       </w:r>
+      <w:proofErr w:type="spellStart"/>
       <w:r>
         <w:rPr>
           <w:b/>
@@ -339,6 +340,7 @@
         </w:rPr>
         <w:t>Lebenslauf</w:t>
       </w:r>
+      <w:proofErr w:type="spellEnd"/>
     </w:p>
     <w:p>
       <w:pPr>
@@ -646,13 +648,23 @@
                 <w:szCs w:val="20"/>
               </w:rPr>
             </w:pPr>
+            <w:proofErr w:type="spellStart"/>
             <w:r>
               <w:rPr>
                 <w:color w:val="000000" w:themeColor="text1"/>
                 <w:sz w:val="20"/>
                 <w:szCs w:val="20"/>
               </w:rPr>
-              <w:t>Adresse:</w:t>
+              <w:t>Adresse</w:t>
+            </w:r>
+            <w:proofErr w:type="spellEnd"/>
+            <w:r>
+              <w:rPr>
+                <w:color w:val="000000" w:themeColor="text1"/>
+                <w:sz w:val="20"/>
+                <w:szCs w:val="20"/>
+              </w:rPr>
+              <w:t>:</w:t>
             </w:r>
           </w:p>
         </w:tc>
@@ -685,13 +697,23 @@
                 <w:szCs w:val="20"/>
               </w:rPr>
             </w:pPr>
+            <w:proofErr w:type="spellStart"/>
             <w:r>
               <w:rPr>
                 <w:color w:val="000000" w:themeColor="text1"/>
                 <w:sz w:val="20"/>
                 <w:szCs w:val="20"/>
               </w:rPr>
-              <w:t>Söderblomstraße 29, 22045 Hamburg</w:t>
+              <w:t>Söderblomstraße</w:t>
+            </w:r>
+            <w:proofErr w:type="spellEnd"/>
+            <w:r>
+              <w:rPr>
+                <w:color w:val="000000" w:themeColor="text1"/>
+                <w:sz w:val="20"/>
+                <w:szCs w:val="20"/>
+              </w:rPr>
+              <w:t xml:space="preserve"> 29, 22045 Hamburg</w:t>
             </w:r>
           </w:p>
         </w:tc>
@@ -716,13 +738,23 @@
                 <w:szCs w:val="20"/>
               </w:rPr>
             </w:pPr>
+            <w:proofErr w:type="spellStart"/>
             <w:r>
               <w:rPr>
                 <w:color w:val="000000" w:themeColor="text1"/>
                 <w:sz w:val="20"/>
                 <w:szCs w:val="20"/>
               </w:rPr>
-              <w:t>Geburtsdatum / -ort:</w:t>
+              <w:t>Geburtsdatum</w:t>
+            </w:r>
+            <w:proofErr w:type="spellEnd"/>
+            <w:r>
+              <w:rPr>
+                <w:color w:val="000000" w:themeColor="text1"/>
+                <w:sz w:val="20"/>
+                <w:szCs w:val="20"/>
+              </w:rPr>
+              <w:t xml:space="preserve"> / -ort:</w:t>
             </w:r>
           </w:p>
         </w:tc>
@@ -776,13 +808,23 @@
                 <w:szCs w:val="20"/>
               </w:rPr>
             </w:pPr>
+            <w:proofErr w:type="spellStart"/>
             <w:r>
               <w:rPr>
                 <w:color w:val="000000" w:themeColor="text1"/>
                 <w:sz w:val="20"/>
                 <w:szCs w:val="20"/>
               </w:rPr>
-              <w:t>Familienstand:</w:t>
+              <w:t>Familienstand</w:t>
+            </w:r>
+            <w:proofErr w:type="spellEnd"/>
+            <w:r>
+              <w:rPr>
+                <w:color w:val="000000" w:themeColor="text1"/>
+                <w:sz w:val="20"/>
+                <w:szCs w:val="20"/>
+              </w:rPr>
+              <w:t>:</w:t>
             </w:r>
           </w:p>
         </w:tc>
@@ -805,14 +847,52 @@
                 <w:szCs w:val="20"/>
               </w:rPr>
             </w:pPr>
+            <w:proofErr w:type="spellStart"/>
             <w:r>
               <w:rPr>
                 <w:color w:val="000000" w:themeColor="text1"/>
                 <w:sz w:val="20"/>
                 <w:szCs w:val="20"/>
               </w:rPr>
-              <w:t>verheiratet, eine Tochter</w:t>
+              <w:t>verheiratet</w:t>
             </w:r>
+            <w:proofErr w:type="spellEnd"/>
+            <w:r>
+              <w:rPr>
+                <w:color w:val="000000" w:themeColor="text1"/>
+                <w:sz w:val="20"/>
+                <w:szCs w:val="20"/>
+              </w:rPr>
+              <w:t xml:space="preserve">, </w:t>
+            </w:r>
+            <w:proofErr w:type="spellStart"/>
+            <w:r>
+              <w:rPr>
+                <w:color w:val="000000" w:themeColor="text1"/>
+                <w:sz w:val="20"/>
+                <w:szCs w:val="20"/>
+              </w:rPr>
+              <w:t>eine</w:t>
+            </w:r>
+            <w:proofErr w:type="spellEnd"/>
+            <w:r>
+              <w:rPr>
+                <w:color w:val="000000" w:themeColor="text1"/>
+                <w:sz w:val="20"/>
+                <w:szCs w:val="20"/>
+              </w:rPr>
+              <w:t xml:space="preserve"> </w:t>
+            </w:r>
+            <w:proofErr w:type="spellStart"/>
+            <w:r>
+              <w:rPr>
+                <w:color w:val="000000" w:themeColor="text1"/>
+                <w:sz w:val="20"/>
+                <w:szCs w:val="20"/>
+              </w:rPr>
+              <w:t>Tochter</w:t>
+            </w:r>
+            <w:proofErr w:type="spellEnd"/>
           </w:p>
         </w:tc>
       </w:tr>
@@ -836,13 +916,23 @@
                 <w:szCs w:val="20"/>
               </w:rPr>
             </w:pPr>
+            <w:proofErr w:type="spellStart"/>
             <w:r>
               <w:rPr>
                 <w:color w:val="000000" w:themeColor="text1"/>
                 <w:sz w:val="20"/>
                 <w:szCs w:val="20"/>
               </w:rPr>
-              <w:t>Staatsangehörigkeit:</w:t>
+              <w:t>Staatsangehörigkeit</w:t>
+            </w:r>
+            <w:proofErr w:type="spellEnd"/>
+            <w:r>
+              <w:rPr>
+                <w:color w:val="000000" w:themeColor="text1"/>
+                <w:sz w:val="20"/>
+                <w:szCs w:val="20"/>
+              </w:rPr>
+              <w:t>:</w:t>
             </w:r>
           </w:p>
         </w:tc>
@@ -865,6 +955,7 @@
                 <w:szCs w:val="20"/>
               </w:rPr>
             </w:pPr>
+            <w:proofErr w:type="spellStart"/>
             <w:r>
               <w:rPr>
                 <w:color w:val="000000" w:themeColor="text1"/>
@@ -873,6 +964,7 @@
               </w:rPr>
               <w:t>deutsch</w:t>
             </w:r>
+            <w:proofErr w:type="spellEnd"/>
           </w:p>
         </w:tc>
       </w:tr>
@@ -896,13 +988,41 @@
                 <w:szCs w:val="20"/>
               </w:rPr>
             </w:pPr>
+            <w:proofErr w:type="spellStart"/>
             <w:r>
               <w:rPr>
                 <w:color w:val="000000" w:themeColor="text1"/>
                 <w:sz w:val="20"/>
                 <w:szCs w:val="20"/>
               </w:rPr>
-              <w:t>Telefon mobil:</w:t>
+              <w:t>Telefon</w:t>
+            </w:r>
+            <w:proofErr w:type="spellEnd"/>
+            <w:r>
+              <w:rPr>
+                <w:color w:val="000000" w:themeColor="text1"/>
+                <w:sz w:val="20"/>
+                <w:szCs w:val="20"/>
+              </w:rPr>
+              <w:t xml:space="preserve"> </w:t>
+            </w:r>
+            <w:proofErr w:type="spellStart"/>
+            <w:r>
+              <w:rPr>
+                <w:color w:val="000000" w:themeColor="text1"/>
+                <w:sz w:val="20"/>
+                <w:szCs w:val="20"/>
+              </w:rPr>
+              <w:t>mobil</w:t>
+            </w:r>
+            <w:proofErr w:type="spellEnd"/>
+            <w:r>
+              <w:rPr>
+                <w:color w:val="000000" w:themeColor="text1"/>
+                <w:sz w:val="20"/>
+                <w:szCs w:val="20"/>
+              </w:rPr>
+              <w:t>:</w:t>
             </w:r>
           </w:p>
         </w:tc>
@@ -1096,6 +1216,7 @@
           <w:szCs w:val="24"/>
         </w:rPr>
       </w:pPr>
+      <w:proofErr w:type="spellStart"/>
       <w:r>
         <w:rPr>
           <w:b/>
@@ -1105,6 +1226,7 @@
         </w:rPr>
         <w:t>Profil</w:t>
       </w:r>
+      <w:proofErr w:type="spellEnd"/>
     </w:p>
     <w:p>
       <w:pPr>
@@ -1336,8 +1458,39 @@
           <w:szCs w:val="20"/>
           <w:lang w:val="de-DE"/>
         </w:rPr>
-        <w:t>Langjährige Erfahrung in der Nutzung agiler Methoden wie Scrum und SAFe</w:t>
+        <w:t xml:space="preserve">Langjährige Erfahrung in der Nutzung agiler Methoden wie </w:t>
       </w:r>
+      <w:proofErr w:type="spellStart"/>
+      <w:r>
+        <w:rPr>
+          <w:color w:val="000000" w:themeColor="text1"/>
+          <w:sz w:val="20"/>
+          <w:szCs w:val="20"/>
+          <w:lang w:val="de-DE"/>
+        </w:rPr>
+        <w:t>Scrum</w:t>
+      </w:r>
+      <w:proofErr w:type="spellEnd"/>
+      <w:r>
+        <w:rPr>
+          <w:color w:val="000000" w:themeColor="text1"/>
+          <w:sz w:val="20"/>
+          <w:szCs w:val="20"/>
+          <w:lang w:val="de-DE"/>
+        </w:rPr>
+        <w:t xml:space="preserve"> und </w:t>
+      </w:r>
+      <w:proofErr w:type="spellStart"/>
+      <w:r>
+        <w:rPr>
+          <w:color w:val="000000" w:themeColor="text1"/>
+          <w:sz w:val="20"/>
+          <w:szCs w:val="20"/>
+          <w:lang w:val="de-DE"/>
+        </w:rPr>
+        <w:t>SAFe</w:t>
+      </w:r>
+      <w:proofErr w:type="spellEnd"/>
     </w:p>
     <w:p>
       <w:pPr>
@@ -1361,7 +1514,47 @@
           <w:szCs w:val="20"/>
           <w:lang w:val="de-DE"/>
         </w:rPr>
-        <w:t>Fundierte Kenntnisse in Java, TypeScript, SQL, Linux-Shells, Docker und Gitlab-CI</w:t>
+        <w:t xml:space="preserve">Fundierte Kenntnisse in Java, </w:t>
+      </w:r>
+      <w:proofErr w:type="spellStart"/>
+      <w:r>
+        <w:rPr>
+          <w:color w:val="000000" w:themeColor="text1"/>
+          <w:sz w:val="20"/>
+          <w:szCs w:val="20"/>
+          <w:lang w:val="de-DE"/>
+        </w:rPr>
+        <w:t>TypeScript</w:t>
+      </w:r>
+      <w:proofErr w:type="spellEnd"/>
+      <w:r>
+        <w:rPr>
+          <w:color w:val="000000" w:themeColor="text1"/>
+          <w:sz w:val="20"/>
+          <w:szCs w:val="20"/>
+          <w:lang w:val="de-DE"/>
+        </w:rPr>
+        <w:t xml:space="preserve">, SQL, Linux-Shells, Docker und </w:t>
+      </w:r>
+      <w:proofErr w:type="spellStart"/>
+      <w:r>
+        <w:rPr>
+          <w:color w:val="000000" w:themeColor="text1"/>
+          <w:sz w:val="20"/>
+          <w:szCs w:val="20"/>
+          <w:lang w:val="de-DE"/>
+        </w:rPr>
+        <w:t>Gitlab</w:t>
+      </w:r>
+      <w:proofErr w:type="spellEnd"/>
+      <w:r>
+        <w:rPr>
+          <w:color w:val="000000" w:themeColor="text1"/>
+          <w:sz w:val="20"/>
+          <w:szCs w:val="20"/>
+          <w:lang w:val="de-DE"/>
+        </w:rPr>
+        <w:t>-CI</w:t>
       </w:r>
     </w:p>
     <w:p>
@@ -1424,6 +1617,7 @@
         </w:rPr>
         <w:br/>
       </w:r>
+      <w:proofErr w:type="spellStart"/>
       <w:r>
         <w:rPr>
           <w:color w:val="000000" w:themeColor="text1"/>
@@ -1431,7 +1625,57 @@
           <w:szCs w:val="20"/>
           <w:lang w:val="de-DE"/>
         </w:rPr>
-        <w:t>Playwright/TypeScript und Selenium/Java/BDD</w:t>
+        <w:t>Playwright</w:t>
+      </w:r>
+      <w:proofErr w:type="spellEnd"/>
+      <w:r>
+        <w:rPr>
+          <w:color w:val="000000" w:themeColor="text1"/>
+          <w:sz w:val="20"/>
+          <w:szCs w:val="20"/>
+          <w:lang w:val="de-DE"/>
+        </w:rPr>
+        <w:t>/</w:t>
+      </w:r>
+      <w:proofErr w:type="spellStart"/>
+      <w:r>
+        <w:rPr>
+          <w:color w:val="000000" w:themeColor="text1"/>
+          <w:sz w:val="20"/>
+          <w:szCs w:val="20"/>
+          <w:lang w:val="de-DE"/>
+        </w:rPr>
+        <w:t>TypeScript</w:t>
+      </w:r>
+      <w:proofErr w:type="spellEnd"/>
+      <w:r>
+        <w:rPr>
+          <w:color w:val="000000" w:themeColor="text1"/>
+          <w:sz w:val="20"/>
+          <w:szCs w:val="20"/>
+          <w:lang w:val="de-DE"/>
+        </w:rPr>
+        <w:t xml:space="preserve"> und </w:t>
+      </w:r>
+      <w:proofErr w:type="spellStart"/>
+      <w:r>
+        <w:rPr>
+          <w:color w:val="000000" w:themeColor="text1"/>
+          <w:sz w:val="20"/>
+          <w:szCs w:val="20"/>
+          <w:lang w:val="de-DE"/>
+        </w:rPr>
+        <w:t>Selenium</w:t>
+      </w:r>
+      <w:proofErr w:type="spellEnd"/>
+      <w:r>
+        <w:rPr>
+          <w:color w:val="000000" w:themeColor="text1"/>
+          <w:sz w:val="20"/>
+          <w:szCs w:val="20"/>
+          <w:lang w:val="de-DE"/>
+        </w:rPr>
+        <w:t>/Java/BDD</w:t>
       </w:r>
     </w:p>
     <w:p>
@@ -1620,6 +1864,7 @@
               </w:rPr>
               <w:t xml:space="preserve">/2026 – </w:t>
             </w:r>
+            <w:proofErr w:type="spellStart"/>
             <w:r>
               <w:rPr>
                 <w:rFonts w:asciiTheme="majorHAnsi" w:hAnsiTheme="majorHAnsi" w:cstheme="majorHAnsi"/>
@@ -1629,6 +1874,7 @@
               </w:rPr>
               <w:t>heute</w:t>
             </w:r>
+            <w:proofErr w:type="spellEnd"/>
           </w:p>
           <w:p>
             <w:pPr>
@@ -1660,6 +1906,8 @@
                 <w:szCs w:val="20"/>
               </w:rPr>
             </w:pPr>
+            <w:proofErr w:type="spellStart"/>
+            <w:proofErr w:type="gramStart"/>
             <w:r>
               <w:rPr>
                 <w:rFonts w:asciiTheme="majorHAnsi" w:hAnsiTheme="majorHAnsi" w:cstheme="majorHAnsi"/>
@@ -1669,6 +1917,8 @@
               </w:rPr>
               <w:t>Testmanager</w:t>
             </w:r>
+            <w:proofErr w:type="spellEnd"/>
+            <w:proofErr w:type="gramEnd"/>
           </w:p>
           <w:p>
             <w:pPr>
@@ -1793,7 +2043,7 @@
                 <w:szCs w:val="20"/>
                 <w:lang w:val="de" w:eastAsia="de-DE"/>
               </w:rPr>
-              <w:t>Tätigkeit 1</w:t>
+              <w:t>Regelmeetings mit dem Testteam</w:t>
             </w:r>
           </w:p>
           <w:p>
@@ -1822,6 +2072,7 @@
                 <w:lang w:val="de" w:eastAsia="de-DE"/>
               </w:rPr>
             </w:pPr>
+            <w:proofErr w:type="spellStart"/>
             <w:r>
               <w:rPr>
                 <w:rFonts w:ascii="Calibri" w:eastAsia="Calibri" w:hAnsi="Calibri" w:cs="Calibri"/>
@@ -1832,7 +2083,61 @@
                 <w:szCs w:val="20"/>
                 <w:lang w:val="de" w:eastAsia="de-DE"/>
               </w:rPr>
-              <w:t>Tätigkeit 2</w:t>
+              <w:t>Testreporting</w:t>
+            </w:r>
+            <w:proofErr w:type="spellEnd"/>
+          </w:p>
+          <w:p>
+            <w:pPr>
+              <w:pStyle w:val="berschrift2"/>
+              <w:keepNext w:val="0"/>
+              <w:keepLines w:val="0"/>
+              <w:widowControl w:val="0"/>
+              <w:numPr>
+                <w:ilvl w:val="0"/>
+                <w:numId w:val="10"/>
+              </w:numPr>
+              <w:tabs>
+                <w:tab w:val="clear" w:pos="720"/>
+                <w:tab w:val="num" w:pos="2345"/>
+              </w:tabs>
+              <w:spacing w:before="1" w:line="242" w:lineRule="auto"/>
+              <w:ind w:left="360"/>
+              <w:rPr>
+                <w:rFonts w:ascii="Calibri" w:eastAsia="Calibri" w:hAnsi="Calibri" w:cs="Calibri"/>
+                <w:b w:val="0"/>
+                <w:bCs w:val="0"/>
+                <w:color w:val="000000"/>
+                <w:sz w:val="20"/>
+                <w:szCs w:val="20"/>
+                <w:lang w:val="de" w:eastAsia="de-DE"/>
+              </w:rPr>
+            </w:pPr>
+            <w:proofErr w:type="spellStart"/>
+            <w:r>
+              <w:rPr>
+                <w:rFonts w:ascii="Calibri" w:eastAsia="Calibri" w:hAnsi="Calibri" w:cs="Calibri"/>
+                <w:b w:val="0"/>
+                <w:bCs w:val="0"/>
+                <w:color w:val="000000"/>
+                <w:sz w:val="20"/>
+                <w:szCs w:val="20"/>
+                <w:lang w:val="de" w:eastAsia="de-DE"/>
+              </w:rPr>
+              <w:t>Defect</w:t>
+            </w:r>
+            <w:proofErr w:type="spellEnd"/>
+            <w:r>
+              <w:rPr>
+                <w:rFonts w:ascii="Calibri" w:eastAsia="Calibri" w:hAnsi="Calibri" w:cs="Calibri"/>
+                <w:b w:val="0"/>
+                <w:bCs w:val="0"/>
+                <w:color w:val="000000"/>
+                <w:sz w:val="20"/>
+                <w:szCs w:val="20"/>
+                <w:lang w:val="de" w:eastAsia="de-DE"/>
+              </w:rPr>
+              <w:t>-Tracking</w:t>
             </w:r>
           </w:p>
           <w:p>
@@ -1871,7 +2176,7 @@
                 <w:szCs w:val="20"/>
                 <w:lang w:val="de" w:eastAsia="de-DE"/>
               </w:rPr>
-              <w:t>Tätigkeit 3</w:t>
+              <w:t>Review der Testfälle</w:t>
             </w:r>
           </w:p>
           <w:p>
@@ -1910,46 +2215,7 @@
                 <w:szCs w:val="20"/>
                 <w:lang w:val="de" w:eastAsia="de-DE"/>
               </w:rPr>
-              <w:t>Tätigkeit 4</w:t>
-            </w:r>
-          </w:p>
-          <w:p>
-            <w:pPr>
-              <w:pStyle w:val="berschrift2"/>
-              <w:keepNext w:val="0"/>
-              <w:keepLines w:val="0"/>
-              <w:widowControl w:val="0"/>
-              <w:numPr>
-                <w:ilvl w:val="0"/>
-                <w:numId w:val="10"/>
-              </w:numPr>
-              <w:tabs>
-                <w:tab w:val="clear" w:pos="720"/>
-                <w:tab w:val="num" w:pos="2345"/>
-              </w:tabs>
-              <w:spacing w:before="1" w:line="242" w:lineRule="auto"/>
-              <w:ind w:left="360"/>
-              <w:rPr>
-                <w:rFonts w:ascii="Calibri" w:eastAsia="Calibri" w:hAnsi="Calibri" w:cs="Calibri"/>
-                <w:b w:val="0"/>
-                <w:bCs w:val="0"/>
-                <w:color w:val="000000"/>
-                <w:sz w:val="20"/>
-                <w:szCs w:val="20"/>
-                <w:lang w:val="de" w:eastAsia="de-DE"/>
-              </w:rPr>
-            </w:pPr>
-            <w:r>
-              <w:rPr>
-                <w:rFonts w:ascii="Calibri" w:eastAsia="Calibri" w:hAnsi="Calibri" w:cs="Calibri"/>
-                <w:b w:val="0"/>
-                <w:bCs w:val="0"/>
-                <w:color w:val="000000"/>
-                <w:sz w:val="20"/>
-                <w:szCs w:val="20"/>
-                <w:lang w:val="de" w:eastAsia="de-DE"/>
-              </w:rPr>
-              <w:t>Tätigkeit 5</w:t>
+              <w:t>Erstellung und Pflege der Teststrategie</w:t>
             </w:r>
           </w:p>
         </w:tc>
@@ -2012,7 +2278,27 @@
                 <w:sz w:val="20"/>
                 <w:szCs w:val="20"/>
               </w:rPr>
-              <w:t>MS-Office, Confluence, MS-Sharepoint</w:t>
+              <w:t>MS-Office, Confluence, MS-</w:t>
+            </w:r>
+            <w:proofErr w:type="spellStart"/>
+            <w:r>
+              <w:rPr>
+                <w:rFonts w:asciiTheme="majorHAnsi" w:hAnsiTheme="majorHAnsi" w:cstheme="majorHAnsi"/>
+                <w:bCs/>
+                <w:sz w:val="20"/>
+                <w:szCs w:val="20"/>
+              </w:rPr>
+              <w:t>Sharepoint</w:t>
+            </w:r>
+            <w:proofErr w:type="spellEnd"/>
+            <w:r>
+              <w:rPr>
+                <w:rFonts w:asciiTheme="majorHAnsi" w:hAnsiTheme="majorHAnsi" w:cstheme="majorHAnsi"/>
+                <w:bCs/>
+                <w:sz w:val="20"/>
+                <w:szCs w:val="20"/>
+              </w:rPr>
+              <w:t>, Jira/Xray</w:t>
             </w:r>
           </w:p>
         </w:tc>
@@ -2145,6 +2431,7 @@
                 <w:szCs w:val="20"/>
               </w:rPr>
             </w:pPr>
+            <w:proofErr w:type="spellStart"/>
             <w:r>
               <w:rPr>
                 <w:rFonts w:asciiTheme="majorHAnsi" w:hAnsiTheme="majorHAnsi" w:cstheme="majorHAnsi"/>
@@ -2154,6 +2441,7 @@
               </w:rPr>
               <w:t>Testautomatisierer</w:t>
             </w:r>
+            <w:proofErr w:type="spellEnd"/>
           </w:p>
           <w:p>
             <w:pPr>
@@ -2297,7 +2585,86 @@
                 <w:szCs w:val="20"/>
                 <w:lang w:val="de" w:eastAsia="de-DE"/>
               </w:rPr>
-              <w:t>Tätigkeit 1</w:t>
+              <w:t xml:space="preserve">Codieren automatisierter Testfälle mit </w:t>
+            </w:r>
+            <w:proofErr w:type="spellStart"/>
+            <w:r>
+              <w:rPr>
+                <w:rFonts w:ascii="Calibri" w:eastAsia="Calibri" w:hAnsi="Calibri" w:cs="Calibri"/>
+                <w:b w:val="0"/>
+                <w:bCs w:val="0"/>
+                <w:color w:val="000000"/>
+                <w:sz w:val="20"/>
+                <w:szCs w:val="20"/>
+                <w:lang w:val="de" w:eastAsia="de-DE"/>
+              </w:rPr>
+              <w:t>Playwright</w:t>
+            </w:r>
+            <w:proofErr w:type="spellEnd"/>
+          </w:p>
+          <w:p>
+            <w:pPr>
+              <w:pStyle w:val="berschrift2"/>
+              <w:keepNext w:val="0"/>
+              <w:keepLines w:val="0"/>
+              <w:widowControl w:val="0"/>
+              <w:numPr>
+                <w:ilvl w:val="0"/>
+                <w:numId w:val="10"/>
+              </w:numPr>
+              <w:tabs>
+                <w:tab w:val="clear" w:pos="720"/>
+                <w:tab w:val="num" w:pos="2345"/>
+              </w:tabs>
+              <w:spacing w:before="1" w:line="242" w:lineRule="auto"/>
+              <w:ind w:left="360"/>
+              <w:rPr>
+                <w:rFonts w:ascii="Calibri" w:eastAsia="Calibri" w:hAnsi="Calibri" w:cs="Calibri"/>
+                <w:b w:val="0"/>
+                <w:bCs w:val="0"/>
+                <w:color w:val="000000"/>
+                <w:sz w:val="20"/>
+                <w:szCs w:val="20"/>
+                <w:lang w:val="de" w:eastAsia="de-DE"/>
+              </w:rPr>
+            </w:pPr>
+            <w:r>
+              <w:rPr>
+                <w:rFonts w:ascii="Calibri" w:eastAsia="Calibri" w:hAnsi="Calibri" w:cs="Calibri"/>
+                <w:b w:val="0"/>
+                <w:bCs w:val="0"/>
+                <w:color w:val="000000"/>
+                <w:sz w:val="20"/>
+                <w:szCs w:val="20"/>
+                <w:lang w:val="de" w:eastAsia="de-DE"/>
+              </w:rPr>
+              <w:t xml:space="preserve">Integration der automatisierten Testausführung in </w:t>
+            </w:r>
+            <w:proofErr w:type="spellStart"/>
+            <w:r>
+              <w:rPr>
+                <w:rFonts w:ascii="Calibri" w:eastAsia="Calibri" w:hAnsi="Calibri" w:cs="Calibri"/>
+                <w:b w:val="0"/>
+                <w:bCs w:val="0"/>
+                <w:color w:val="000000"/>
+                <w:sz w:val="20"/>
+                <w:szCs w:val="20"/>
+                <w:lang w:val="de" w:eastAsia="de-DE"/>
+              </w:rPr>
+              <w:t>gitlab</w:t>
+            </w:r>
+            <w:proofErr w:type="spellEnd"/>
+            <w:r>
+              <w:rPr>
+                <w:rFonts w:ascii="Calibri" w:eastAsia="Calibri" w:hAnsi="Calibri" w:cs="Calibri"/>
+                <w:b w:val="0"/>
+                <w:bCs w:val="0"/>
+                <w:color w:val="000000"/>
+                <w:sz w:val="20"/>
+                <w:szCs w:val="20"/>
+                <w:lang w:val="de" w:eastAsia="de-DE"/>
+              </w:rPr>
+              <w:t>-CI-Pipeline</w:t>
             </w:r>
           </w:p>
           <w:p>
@@ -2336,7 +2703,7 @@
                 <w:szCs w:val="20"/>
                 <w:lang w:val="de" w:eastAsia="de-DE"/>
               </w:rPr>
-              <w:t>Tätigkeit 2</w:t>
+              <w:t>Regelmäßige Prüfung der Ergebnisse der automatisierten Tests</w:t>
             </w:r>
           </w:p>
           <w:p>
@@ -2375,7 +2742,7 @@
                 <w:szCs w:val="20"/>
                 <w:lang w:val="de" w:eastAsia="de-DE"/>
               </w:rPr>
-              <w:t>Tätigkeit 3</w:t>
+              <w:t>Formulieren der Testfälle in Gherkin</w:t>
             </w:r>
           </w:p>
           <w:p>
@@ -2414,25 +2781,10 @@
                 <w:szCs w:val="20"/>
                 <w:lang w:val="de" w:eastAsia="de-DE"/>
               </w:rPr>
-              <w:t>Tätigkeit 4</w:t>
+              <w:t xml:space="preserve">Regelmeetings im </w:t>
             </w:r>
-          </w:p>
-          <w:p>
-            <w:pPr>
-              <w:pStyle w:val="berschrift2"/>
-              <w:keepNext w:val="0"/>
-              <w:keepLines w:val="0"/>
-              <w:widowControl w:val="0"/>
-              <w:numPr>
-                <w:ilvl w:val="0"/>
-                <w:numId w:val="10"/>
-              </w:numPr>
-              <w:tabs>
-                <w:tab w:val="clear" w:pos="720"/>
-                <w:tab w:val="num" w:pos="2345"/>
-              </w:tabs>
-              <w:spacing w:before="1" w:line="242" w:lineRule="auto"/>
-              <w:ind w:left="360"/>
+            <w:proofErr w:type="spellStart"/>
+            <w:r>
               <w:rPr>
                 <w:rFonts w:ascii="Calibri" w:eastAsia="Calibri" w:hAnsi="Calibri" w:cs="Calibri"/>
                 <w:b w:val="0"/>
@@ -2442,7 +2794,9 @@
                 <w:szCs w:val="20"/>
                 <w:lang w:val="de" w:eastAsia="de-DE"/>
               </w:rPr>
-            </w:pPr>
+              <w:t>Scrum</w:t>
+            </w:r>
+            <w:proofErr w:type="spellEnd"/>
             <w:r>
               <w:rPr>
                 <w:rFonts w:ascii="Calibri" w:eastAsia="Calibri" w:hAnsi="Calibri" w:cs="Calibri"/>
@@ -2453,7 +2807,7 @@
                 <w:szCs w:val="20"/>
                 <w:lang w:val="de" w:eastAsia="de-DE"/>
               </w:rPr>
-              <w:t>Tätigkeit 5</w:t>
+              <w:t>-Team</w:t>
             </w:r>
           </w:p>
           <w:p>
@@ -2491,7 +2845,7 @@
                 <w:szCs w:val="20"/>
                 <w:lang w:val="de" w:eastAsia="de-DE"/>
               </w:rPr>
-              <w:t>Tätigkeit 6</w:t>
+              <w:t>Pflege der Testdokumentation</w:t>
             </w:r>
           </w:p>
         </w:tc>
@@ -2540,23 +2894,29 @@
             </w:pPr>
             <w:r>
               <w:rPr>
-                <w:rFonts w:asciiTheme="majorHAnsi" w:hAnsiTheme="majorHAnsi" w:cstheme="majorHAnsi"/>
-                <w:bCs/>
-                <w:sz w:val="20"/>
-                <w:szCs w:val="20"/>
-                <w:lang w:val="fr-FR"/>
-              </w:rPr>
-              <w:t>SAP-S/4HANA, Jira/Xray, Confluence, Office 365, MS Teams</w:t>
+                <w:rFonts w:ascii="Calibri" w:eastAsia="Calibri" w:hAnsi="Calibri" w:cs="Calibri"/>
+              </w:rPr>
+              <w:t xml:space="preserve">SAP S/4HANA, Playwright, TypeScript, JavaScript, </w:t>
+            </w:r>
+            <w:proofErr w:type="spellStart"/>
+            <w:r>
+              <w:rPr>
+                <w:rFonts w:ascii="Calibri" w:eastAsia="Calibri" w:hAnsi="Calibri" w:cs="Calibri"/>
+              </w:rPr>
+              <w:t>gitlab</w:t>
+            </w:r>
+            <w:proofErr w:type="spellEnd"/>
+            <w:r>
+              <w:rPr>
+                <w:rFonts w:ascii="Calibri" w:eastAsia="Calibri" w:hAnsi="Calibri" w:cs="Calibri"/>
+              </w:rPr>
+              <w:t>, Eclipse Che, Docker, Jira/Xray, Harbour Container-Repository</w:t>
             </w:r>
             <w:r>
               <w:rPr>
-                <w:rFonts w:asciiTheme="majorHAnsi" w:hAnsiTheme="majorHAnsi" w:cstheme="majorHAnsi"/>
-                <w:bCs/>
-                <w:sz w:val="20"/>
-                <w:szCs w:val="20"/>
-                <w:lang w:val="fr-FR"/>
-              </w:rPr>
-              <w:t>, Playwright</w:t>
+                <w:rFonts w:ascii="Calibri" w:eastAsia="Calibri" w:hAnsi="Calibri" w:cs="Calibri"/>
+              </w:rPr>
+              <w:t>, Confluence</w:t>
             </w:r>
           </w:p>
         </w:tc>
@@ -2699,6 +3059,7 @@
                 <w:lang w:val="de"/>
               </w:rPr>
             </w:pPr>
+            <w:proofErr w:type="spellStart"/>
             <w:r>
               <w:rPr>
                 <w:rFonts w:asciiTheme="majorHAnsi" w:hAnsiTheme="majorHAnsi" w:cstheme="majorHAnsi"/>
@@ -2709,6 +3070,7 @@
               </w:rPr>
               <w:t>Testautomatisierer</w:t>
             </w:r>
+            <w:proofErr w:type="spellEnd"/>
           </w:p>
           <w:p>
             <w:pPr>
@@ -2862,7 +3224,33 @@
                 <w:szCs w:val="20"/>
                 <w:lang w:val="de" w:eastAsia="de-DE"/>
               </w:rPr>
-              <w:t>Tätigkeit 1</w:t>
+              <w:t xml:space="preserve">Codieren automatisierter Testfälle mit </w:t>
+            </w:r>
+            <w:proofErr w:type="spellStart"/>
+            <w:r>
+              <w:rPr>
+                <w:rFonts w:ascii="Calibri" w:eastAsia="Calibri" w:hAnsi="Calibri" w:cs="Calibri"/>
+                <w:b w:val="0"/>
+                <w:bCs w:val="0"/>
+                <w:color w:val="000000"/>
+                <w:sz w:val="20"/>
+                <w:szCs w:val="20"/>
+                <w:lang w:val="de" w:eastAsia="de-DE"/>
+              </w:rPr>
+              <w:t>Selenium</w:t>
+            </w:r>
+            <w:proofErr w:type="spellEnd"/>
+            <w:r>
+              <w:rPr>
+                <w:rFonts w:ascii="Calibri" w:eastAsia="Calibri" w:hAnsi="Calibri" w:cs="Calibri"/>
+                <w:b w:val="0"/>
+                <w:bCs w:val="0"/>
+                <w:color w:val="000000"/>
+                <w:sz w:val="20"/>
+                <w:szCs w:val="20"/>
+                <w:lang w:val="de" w:eastAsia="de-DE"/>
+              </w:rPr>
+              <w:t>/Java</w:t>
             </w:r>
           </w:p>
           <w:p>
@@ -2901,7 +3289,7 @@
                 <w:szCs w:val="20"/>
                 <w:lang w:val="de" w:eastAsia="de-DE"/>
               </w:rPr>
-              <w:t>Tätigkeit 2</w:t>
+              <w:t>Auswahl und Analyse der manuellen Testfälle für die Automatisierung</w:t>
             </w:r>
           </w:p>
           <w:p>
@@ -2940,7 +3328,33 @@
                 <w:szCs w:val="20"/>
                 <w:lang w:val="de" w:eastAsia="de-DE"/>
               </w:rPr>
-              <w:t>Tätigkeit 3</w:t>
+              <w:t xml:space="preserve">Regelmeetings im </w:t>
+            </w:r>
+            <w:proofErr w:type="spellStart"/>
+            <w:r>
+              <w:rPr>
+                <w:rFonts w:ascii="Calibri" w:eastAsia="Calibri" w:hAnsi="Calibri" w:cs="Calibri"/>
+                <w:b w:val="0"/>
+                <w:bCs w:val="0"/>
+                <w:color w:val="000000"/>
+                <w:sz w:val="20"/>
+                <w:szCs w:val="20"/>
+                <w:lang w:val="de" w:eastAsia="de-DE"/>
+              </w:rPr>
+              <w:t>Scrum</w:t>
+            </w:r>
+            <w:proofErr w:type="spellEnd"/>
+            <w:r>
+              <w:rPr>
+                <w:rFonts w:ascii="Calibri" w:eastAsia="Calibri" w:hAnsi="Calibri" w:cs="Calibri"/>
+                <w:b w:val="0"/>
+                <w:bCs w:val="0"/>
+                <w:color w:val="000000"/>
+                <w:sz w:val="20"/>
+                <w:szCs w:val="20"/>
+                <w:lang w:val="de" w:eastAsia="de-DE"/>
+              </w:rPr>
+              <w:t>-Team</w:t>
             </w:r>
           </w:p>
           <w:p>
@@ -2979,7 +3393,7 @@
                 <w:szCs w:val="20"/>
                 <w:lang w:val="de" w:eastAsia="de-DE"/>
               </w:rPr>
-              <w:t>Tätigkeit 4</w:t>
+              <w:t>Fehleranalyse</w:t>
             </w:r>
           </w:p>
         </w:tc>
@@ -3030,7 +3444,19 @@
               <w:rPr>
                 <w:rFonts w:ascii="Calibri" w:eastAsia="Calibri" w:hAnsi="Calibri" w:cs="Calibri"/>
               </w:rPr>
-              <w:t>SAP S/4HANA, Playwright, TypeScript, JavaScript, gitlab, Eclipse Che, Docker, Jira/Xray, Harbour Container-Repository</w:t>
+              <w:t xml:space="preserve">SAP S/4HANA, </w:t>
+            </w:r>
+            <w:r>
+              <w:rPr>
+                <w:rFonts w:ascii="Calibri" w:eastAsia="Calibri" w:hAnsi="Calibri" w:cs="Calibri"/>
+              </w:rPr>
+              <w:t xml:space="preserve">Selenium, Java, Jenkins, MS Office, Confluence, </w:t>
+            </w:r>
+            <w:r>
+              <w:rPr>
+                <w:rFonts w:ascii="Calibri" w:eastAsia="Calibri" w:hAnsi="Calibri" w:cs="Calibri"/>
+              </w:rPr>
+              <w:t>Jira/Xray</w:t>
             </w:r>
           </w:p>
         </w:tc>
@@ -3056,6 +3482,7 @@
           <w:szCs w:val="24"/>
         </w:rPr>
       </w:pPr>
+      <w:proofErr w:type="spellStart"/>
       <w:r>
         <w:rPr>
           <w:b/>
@@ -3065,6 +3492,7 @@
         </w:rPr>
         <w:t>Ausbildung</w:t>
       </w:r>
+      <w:proofErr w:type="spellEnd"/>
     </w:p>
     <w:tbl>
       <w:tblPr>
@@ -3111,7 +3539,23 @@
                 <w:sz w:val="20"/>
                 <w:szCs w:val="20"/>
               </w:rPr>
-              <w:t>12/1994</w:t>
+              <w:t>06</w:t>
+            </w:r>
+            <w:r>
+              <w:rPr>
+                <w:color w:val="000000" w:themeColor="text1"/>
+                <w:sz w:val="20"/>
+                <w:szCs w:val="20"/>
+              </w:rPr>
+              <w:t>/</w:t>
+            </w:r>
+            <w:r>
+              <w:rPr>
+                <w:color w:val="000000" w:themeColor="text1"/>
+                <w:sz w:val="20"/>
+                <w:szCs w:val="20"/>
+              </w:rPr>
+              <w:t>2010</w:t>
             </w:r>
           </w:p>
         </w:tc>
@@ -3150,7 +3594,7 @@
                 <w:szCs w:val="20"/>
                 <w:lang w:val="de-DE"/>
               </w:rPr>
-              <w:t>Promotion in der Fachrichtung Maschinenbau</w:t>
+              <w:t>Master Wirtschaftsinformatik, HAW Hamburg</w:t>
             </w:r>
           </w:p>
           <w:p>
@@ -3260,7 +3704,23 @@
                 <w:sz w:val="20"/>
                 <w:szCs w:val="20"/>
               </w:rPr>
-              <w:t>03/1989</w:t>
+              <w:t>03</w:t>
+            </w:r>
+            <w:r>
+              <w:rPr>
+                <w:color w:val="000000" w:themeColor="text1"/>
+                <w:sz w:val="20"/>
+                <w:szCs w:val="20"/>
+              </w:rPr>
+              <w:t>/</w:t>
+            </w:r>
+            <w:r>
+              <w:rPr>
+                <w:color w:val="000000" w:themeColor="text1"/>
+                <w:sz w:val="20"/>
+                <w:szCs w:val="20"/>
+              </w:rPr>
+              <w:t>2008</w:t>
             </w:r>
           </w:p>
         </w:tc>
@@ -3309,7 +3769,17 @@
                 <w:szCs w:val="20"/>
                 <w:lang w:val="de-DE"/>
               </w:rPr>
-              <w:t>Diplom, Fachrichtung Physikalische Ingenieurwissenschaft</w:t>
+              <w:t>Batchelor</w:t>
+            </w:r>
+            <w:r>
+              <w:rPr>
+                <w:b/>
+                <w:color w:val="000000" w:themeColor="text1"/>
+                <w:sz w:val="20"/>
+                <w:szCs w:val="20"/>
+                <w:lang w:val="de-DE"/>
+              </w:rPr>
+              <w:t xml:space="preserve"> Wirtschaftsinformatik, HAW Hamburg</w:t>
             </w:r>
           </w:p>
           <w:p>
@@ -3405,6 +3875,7 @@
           <w:szCs w:val="24"/>
         </w:rPr>
       </w:pPr>
+      <w:proofErr w:type="spellStart"/>
       <w:r>
         <w:rPr>
           <w:b/>
@@ -3412,8 +3883,29 @@
           <w:sz w:val="24"/>
           <w:szCs w:val="24"/>
         </w:rPr>
-        <w:t>Sonstige Kenntnisse</w:t>
+        <w:t>Sonstige</w:t>
       </w:r>
+      <w:proofErr w:type="spellEnd"/>
+      <w:r>
+        <w:rPr>
+          <w:b/>
+          <w:color w:val="1F4E79"/>
+          <w:sz w:val="24"/>
+          <w:szCs w:val="24"/>
+        </w:rPr>
+        <w:t xml:space="preserve"> </w:t>
+      </w:r>
+      <w:proofErr w:type="spellStart"/>
+      <w:r>
+        <w:rPr>
+          <w:b/>
+          <w:color w:val="1F4E79"/>
+          <w:sz w:val="24"/>
+          <w:szCs w:val="24"/>
+        </w:rPr>
+        <w:t>Kenntnisse</w:t>
+      </w:r>
+      <w:proofErr w:type="spellEnd"/>
     </w:p>
     <w:tbl>
       <w:tblPr>
@@ -3448,13 +3940,23 @@
                 <w:szCs w:val="20"/>
               </w:rPr>
             </w:pPr>
+            <w:proofErr w:type="spellStart"/>
             <w:r>
               <w:rPr>
                 <w:color w:val="000000" w:themeColor="text1"/>
                 <w:sz w:val="20"/>
                 <w:szCs w:val="20"/>
               </w:rPr>
-              <w:t>Sprachen:</w:t>
+              <w:t>Sprachen</w:t>
+            </w:r>
+            <w:proofErr w:type="spellEnd"/>
+            <w:r>
+              <w:rPr>
+                <w:color w:val="000000" w:themeColor="text1"/>
+                <w:sz w:val="20"/>
+                <w:szCs w:val="20"/>
+              </w:rPr>
+              <w:t>:</w:t>
             </w:r>
           </w:p>
         </w:tc>
@@ -3506,26 +4008,6 @@
                 <w:lang w:val="de-DE"/>
               </w:rPr>
               <w:t>Englisch         fließend</w:t>
-            </w:r>
-          </w:p>
-          <w:p>
-            <w:pPr>
-              <w:spacing w:after="0" w:line="235" w:lineRule="auto"/>
-              <w:rPr>
-                <w:color w:val="000000" w:themeColor="text1"/>
-                <w:sz w:val="20"/>
-                <w:szCs w:val="20"/>
-                <w:lang w:val="de-DE"/>
-              </w:rPr>
-            </w:pPr>
-            <w:r>
-              <w:rPr>
-                <w:color w:val="000000" w:themeColor="text1"/>
-                <w:sz w:val="20"/>
-                <w:szCs w:val="20"/>
-                <w:lang w:val="de-DE"/>
-              </w:rPr>
-              <w:t>Französisch  mittlere Kenntnisse (B1)</w:t>
             </w:r>
           </w:p>
         </w:tc>
@@ -3563,13 +4045,23 @@
                 <w:szCs w:val="20"/>
               </w:rPr>
             </w:pPr>
+            <w:proofErr w:type="spellStart"/>
             <w:r>
               <w:rPr>
                 <w:color w:val="000000" w:themeColor="text1"/>
                 <w:sz w:val="20"/>
                 <w:szCs w:val="20"/>
               </w:rPr>
-              <w:t>Programmiersprachen:</w:t>
+              <w:t>Programmiersprachen</w:t>
+            </w:r>
+            <w:proofErr w:type="spellEnd"/>
+            <w:r>
+              <w:rPr>
+                <w:color w:val="000000" w:themeColor="text1"/>
+                <w:sz w:val="20"/>
+                <w:szCs w:val="20"/>
+              </w:rPr>
+              <w:t>:</w:t>
             </w:r>
           </w:p>
         </w:tc>
@@ -3714,6 +4206,7 @@
           <w:szCs w:val="24"/>
         </w:rPr>
       </w:pPr>
+      <w:proofErr w:type="spellStart"/>
       <w:r>
         <w:rPr>
           <w:b/>
@@ -3721,7 +4214,17 @@
           <w:sz w:val="24"/>
           <w:szCs w:val="24"/>
         </w:rPr>
-        <w:t>Zertifizierungen/Trainings</w:t>
+        <w:t>Zertifizierungen</w:t>
+      </w:r>
+      <w:proofErr w:type="spellEnd"/>
+      <w:r>
+        <w:rPr>
+          <w:b/>
+          <w:color w:val="1F4E79"/>
+          <w:sz w:val="24"/>
+          <w:szCs w:val="24"/>
+        </w:rPr>
+        <w:t>/Trainings</w:t>
       </w:r>
     </w:p>
     <w:p>
@@ -3744,7 +4247,41 @@
           <w:sz w:val="20"/>
           <w:szCs w:val="20"/>
         </w:rPr>
-        <w:t>Ceritfied SAFe 4 Agilist</w:t>
+        <w:t>Cert</w:t>
+      </w:r>
+      <w:r>
+        <w:rPr>
+          <w:color w:val="000000" w:themeColor="text1"/>
+          <w:sz w:val="20"/>
+          <w:szCs w:val="20"/>
+        </w:rPr>
+        <w:t>i</w:t>
+      </w:r>
+      <w:r>
+        <w:rPr>
+          <w:color w:val="000000" w:themeColor="text1"/>
+          <w:sz w:val="20"/>
+          <w:szCs w:val="20"/>
+        </w:rPr>
+        <w:t xml:space="preserve">fied </w:t>
+      </w:r>
+      <w:proofErr w:type="spellStart"/>
+      <w:r>
+        <w:rPr>
+          <w:color w:val="000000" w:themeColor="text1"/>
+          <w:sz w:val="20"/>
+          <w:szCs w:val="20"/>
+        </w:rPr>
+        <w:t>SAFe</w:t>
+      </w:r>
+      <w:proofErr w:type="spellEnd"/>
+      <w:r>
+        <w:rPr>
+          <w:color w:val="000000" w:themeColor="text1"/>
+          <w:sz w:val="20"/>
+          <w:szCs w:val="20"/>
+        </w:rPr>
+        <w:t xml:space="preserve"> 4 Agilist</w:t>
       </w:r>
     </w:p>
     <w:p>
@@ -3767,7 +4304,56 @@
           <w:sz w:val="20"/>
           <w:szCs w:val="20"/>
         </w:rPr>
-        <w:t>ISTQB Certified Tester - Full Advanced Level</w:t>
+        <w:t xml:space="preserve">ISTQB Certified Tester - </w:t>
+      </w:r>
+      <w:r>
+        <w:rPr>
+          <w:color w:val="000000" w:themeColor="text1"/>
+          <w:sz w:val="20"/>
+          <w:szCs w:val="20"/>
+        </w:rPr>
+        <w:t>Foundation</w:t>
+      </w:r>
+      <w:r>
+        <w:rPr>
+          <w:color w:val="000000" w:themeColor="text1"/>
+          <w:sz w:val="20"/>
+          <w:szCs w:val="20"/>
+        </w:rPr>
+        <w:t xml:space="preserve"> Level</w:t>
+      </w:r>
+    </w:p>
+    <w:p>
+      <w:pPr>
+        <w:pStyle w:val="Aufzhlungszeichen"/>
+        <w:tabs>
+          <w:tab w:val="num" w:pos="2407"/>
+        </w:tabs>
+        <w:spacing w:after="14" w:line="360" w:lineRule="auto"/>
+        <w:ind w:left="2302" w:hanging="142"/>
+        <w:rPr>
+          <w:color w:val="000000" w:themeColor="text1"/>
+          <w:sz w:val="20"/>
+          <w:szCs w:val="20"/>
+        </w:rPr>
+      </w:pPr>
+      <w:proofErr w:type="spellStart"/>
+      <w:r>
+        <w:rPr>
+          <w:color w:val="000000" w:themeColor="text1"/>
+          <w:sz w:val="20"/>
+          <w:szCs w:val="20"/>
+        </w:rPr>
+        <w:t>iSQI</w:t>
+      </w:r>
+      <w:proofErr w:type="spellEnd"/>
+      <w:r>
+        <w:rPr>
+          <w:color w:val="000000" w:themeColor="text1"/>
+          <w:sz w:val="20"/>
+          <w:szCs w:val="20"/>
+        </w:rPr>
+        <w:t xml:space="preserve"> Certified Agile Tester</w:t>
       </w:r>
     </w:p>
     <w:p>
@@ -3790,91 +4376,36 @@
           <w:sz w:val="20"/>
           <w:szCs w:val="20"/>
         </w:rPr>
-        <w:t>iSQI Certified Agile Tester</w:t>
+        <w:t xml:space="preserve">Zwei </w:t>
       </w:r>
-    </w:p>
-    <w:p>
-      <w:pPr>
-        <w:pStyle w:val="Aufzhlungszeichen"/>
-        <w:tabs>
-          <w:tab w:val="num" w:pos="2407"/>
-        </w:tabs>
-        <w:spacing w:after="14" w:line="360" w:lineRule="auto"/>
-        <w:ind w:left="2302" w:hanging="142"/>
-        <w:rPr>
-          <w:color w:val="000000" w:themeColor="text1"/>
-          <w:sz w:val="20"/>
-          <w:szCs w:val="20"/>
-        </w:rPr>
-      </w:pPr>
+      <w:proofErr w:type="spellStart"/>
       <w:r>
         <w:rPr>
           <w:color w:val="000000" w:themeColor="text1"/>
           <w:sz w:val="20"/>
           <w:szCs w:val="20"/>
         </w:rPr>
-        <w:t>Zwei Tricentis-Tosca-Zertifizierungen</w:t>
+        <w:t>Tricentis</w:t>
       </w:r>
-    </w:p>
-    <w:p>
-      <w:pPr>
-        <w:pStyle w:val="Aufzhlungszeichen"/>
-        <w:tabs>
-          <w:tab w:val="num" w:pos="2407"/>
-        </w:tabs>
-        <w:spacing w:after="14" w:line="360" w:lineRule="auto"/>
-        <w:ind w:left="2302" w:hanging="142"/>
-        <w:rPr>
-          <w:color w:val="000000" w:themeColor="text1"/>
-          <w:sz w:val="20"/>
-          <w:szCs w:val="20"/>
-        </w:rPr>
-      </w:pPr>
+      <w:proofErr w:type="spellEnd"/>
       <w:r>
         <w:rPr>
           <w:color w:val="000000" w:themeColor="text1"/>
           <w:sz w:val="20"/>
           <w:szCs w:val="20"/>
         </w:rPr>
-        <w:t>Certified Professional for Requirements Engineering (IREB) – Foundation Level</w:t>
+        <w:t>-Tosca-</w:t>
       </w:r>
-    </w:p>
-    <w:p>
-      <w:pPr>
-        <w:pStyle w:val="Aufzhlungszeichen"/>
-        <w:tabs>
-          <w:tab w:val="num" w:pos="2407"/>
-        </w:tabs>
-        <w:spacing w:after="14" w:line="360" w:lineRule="auto"/>
-        <w:ind w:left="2302" w:hanging="142"/>
-        <w:rPr>
-          <w:color w:val="000000" w:themeColor="text1"/>
-          <w:sz w:val="20"/>
-          <w:szCs w:val="20"/>
-          <w:lang w:val="de-DE"/>
-        </w:rPr>
-      </w:pPr>
+      <w:proofErr w:type="spellStart"/>
       <w:r>
         <w:rPr>
           <w:color w:val="000000" w:themeColor="text1"/>
           <w:sz w:val="20"/>
           <w:szCs w:val="20"/>
-          <w:lang w:val="de-DE"/>
         </w:rPr>
-        <w:t>Training: GenAI für Design, RE &amp; QE – GenAI-Unterstützung in IT-Projekten</w:t>
+        <w:t>Zertifizierungen</w:t>
       </w:r>
-    </w:p>
-    <w:p>
-      <w:pPr>
-        <w:keepNext/>
-        <w:spacing w:before="109" w:after="58"/>
-        <w:rPr>
-          <w:b/>
-          <w:color w:val="1F4E79"/>
-          <w:sz w:val="23"/>
-          <w:lang w:val="de-DE"/>
-        </w:rPr>
-      </w:pPr>
+      <w:proofErr w:type="spellEnd"/>
     </w:p>
     <w:p>
       <w:pPr>
@@ -3885,6 +4416,7 @@
           <w:szCs w:val="24"/>
         </w:rPr>
       </w:pPr>
+      <w:proofErr w:type="spellStart"/>
       <w:r>
         <w:rPr>
           <w:b/>
@@ -3894,6 +4426,7 @@
         </w:rPr>
         <w:t>Vorträge</w:t>
       </w:r>
+      <w:proofErr w:type="spellEnd"/>
     </w:p>
     <w:p>
       <w:pPr>
@@ -3905,13 +4438,23 @@
           <w:szCs w:val="20"/>
         </w:rPr>
       </w:pPr>
+      <w:proofErr w:type="spellStart"/>
       <w:r>
         <w:rPr>
           <w:color w:val="000000" w:themeColor="text1"/>
           <w:sz w:val="20"/>
           <w:szCs w:val="20"/>
         </w:rPr>
-        <w:t>Vortrag „</w:t>
+        <w:t>Vortrag</w:t>
+      </w:r>
+      <w:proofErr w:type="spellEnd"/>
+      <w:r>
+        <w:rPr>
+          <w:color w:val="000000" w:themeColor="text1"/>
+          <w:sz w:val="20"/>
+          <w:szCs w:val="20"/>
+        </w:rPr>
+        <w:t xml:space="preserve"> „</w:t>
       </w:r>
       <w:r>
         <w:rPr>
@@ -3929,7 +4472,25 @@
           <w:sz w:val="20"/>
           <w:szCs w:val="20"/>
         </w:rPr>
-        <w:t>”, gehalten auf der NTT DATA Agile/DevOps Global Conference 2022 (online)</w:t>
+        <w:t xml:space="preserve">”, </w:t>
+      </w:r>
+      <w:proofErr w:type="spellStart"/>
+      <w:r>
+        <w:rPr>
+          <w:color w:val="000000" w:themeColor="text1"/>
+          <w:sz w:val="20"/>
+          <w:szCs w:val="20"/>
+        </w:rPr>
+        <w:t>gehalten</w:t>
+      </w:r>
+      <w:proofErr w:type="spellEnd"/>
+      <w:r>
+        <w:rPr>
+          <w:color w:val="000000" w:themeColor="text1"/>
+          <w:sz w:val="20"/>
+          <w:szCs w:val="20"/>
+        </w:rPr>
+        <w:t xml:space="preserve"> auf der NTT DATA Agile/DevOps Global Conference 2022 (online)</w:t>
       </w:r>
     </w:p>
     <w:p>
@@ -4200,14 +4761,39 @@
         <w:color w:val="82909C"/>
         <w:sz w:val="16"/>
       </w:rPr>
-      <w:t xml:space="preserve">Dr. Frank Bergemann  ·  </w:t>
+      <w:t xml:space="preserve">Dr. Frank </w:t>
     </w:r>
+    <w:proofErr w:type="gramStart"/>
+    <w:r>
+      <w:rPr>
+        <w:color w:val="82909C"/>
+        <w:sz w:val="16"/>
+      </w:rPr>
+      <w:t>Bergemann  ·</w:t>
+    </w:r>
+    <w:proofErr w:type="gramEnd"/>
+    <w:r>
+      <w:rPr>
+        <w:color w:val="82909C"/>
+        <w:sz w:val="16"/>
+      </w:rPr>
+      <w:t xml:space="preserve">  </w:t>
+    </w:r>
+    <w:proofErr w:type="spellStart"/>
     <w:r>
       <w:rPr>
         <w:color w:val="646464"/>
         <w:sz w:val="16"/>
       </w:rPr>
-      <w:t xml:space="preserve">Seite </w:t>
+      <w:t>Seite</w:t>
+    </w:r>
+    <w:proofErr w:type="spellEnd"/>
+    <w:r>
+      <w:rPr>
+        <w:color w:val="646464"/>
+        <w:sz w:val="16"/>
+      </w:rPr>
+      <w:t xml:space="preserve"> </w:t>
     </w:r>
     <w:r>
       <w:rPr>

</xml_diff>